<commit_message>
docs: fix unreadable screenshot and log encoding
Co-authored-by: Cursor <cursoragent@cursor.com>
</commit_message>
<xml_diff>
--- a/reports/BudgetCalculator_TestReport.docx
+++ b/reports/BudgetCalculator_TestReport.docx
@@ -29,7 +29,6 @@
     <w:p>
       <w:r>
         <w:rPr>
-          <w:b w:val="0"/>
           <w:sz w:val="24"/>
         </w:rPr>
         <w:t>Студент: Прилепов Никита Алексеевич</w:t>
@@ -38,7 +37,6 @@
     <w:p>
       <w:r>
         <w:rPr>
-          <w:b w:val="0"/>
           <w:sz w:val="24"/>
         </w:rPr>
         <w:t>Группа: 4P1.23</w:t>
@@ -47,7 +45,6 @@
     <w:p>
       <w:r>
         <w:rPr>
-          <w:b w:val="0"/>
           <w:sz w:val="24"/>
         </w:rPr>
         <w:t>Дата: 2026-10-12</w:t>
@@ -56,7 +53,6 @@
     <w:p>
       <w:r>
         <w:rPr>
-          <w:b w:val="0"/>
           <w:sz w:val="24"/>
         </w:rPr>
       </w:r>
@@ -73,7 +69,6 @@
     <w:p>
       <w:r>
         <w:rPr>
-          <w:b w:val="0"/>
           <w:sz w:val="24"/>
         </w:rPr>
         <w:t>Нужно было разобраться с unit-тестами для ASP.NET Core контроллера расчёта бюджета: написать xUnit-тесты, поймать ошибку в страховке, исправить её и посмотреть покрытие кода.</w:t>
@@ -91,7 +86,6 @@
     <w:p>
       <w:r>
         <w:rPr>
-          <w:b w:val="0"/>
           <w:sz w:val="24"/>
         </w:rPr>
         <w:t>Стартового репозитория в рабочей папке не оказалось, поэтому собрал минимальный ASP.NET Core Web API (net9.0) по примеру из задания: модель BudgetRequest и BudgetController с маршрутом POST /api/budget/calculate.</w:t>
@@ -100,7 +94,6 @@
     <w:p>
       <w:r>
         <w:rPr>
-          <w:b w:val="0"/>
           <w:sz w:val="24"/>
         </w:rPr>
         <w:t>Стек: .NET SDK 9.0.318, xUnit 2.9.2, Microsoft.NET.Test.Sdk, xunit.runner.visualstudio, coverlet.collector. Тесты вызывают контроллер напрямую, без поднятия HTTP-сервера.</w:t>
@@ -118,7 +111,6 @@
     <w:p>
       <w:r>
         <w:rPr>
-          <w:b w:val="0"/>
           <w:sz w:val="24"/>
         </w:rPr>
         <w:t>Сначала проверил обычный расчёт без страховки. На стоимости 100 рублей за день и пяти днях получилось 500 рублей — тест прошёл.</w:t>
@@ -130,7 +122,7 @@
           <w:rFonts w:ascii="Consolas" w:hAnsi="Consolas"/>
           <w:sz w:val="18"/>
         </w:rPr>
-        <w:t>DailyCost = 100, Days = 5, IncludeInsurance = false → TotalAmount = 500, HTTP 200</w:t>
+        <w:t>DailyCost = 100, Days = 5, IncludeInsurance = false -&gt; TotalAmount = 500, HTTP 200</w:t>
       </w:r>
     </w:p>
     <w:p>
@@ -145,7 +137,6 @@
     <w:p>
       <w:r>
         <w:rPr>
-          <w:b w:val="0"/>
           <w:sz w:val="24"/>
         </w:rPr>
         <w:t>Потом добавил проверку со страховкой и увидел, что вместо 525 рублей метод возвращает 2500. Ошибка оказалась в коэффициенте: стоимость умножалась на 5 вместо увеличения на 5%.</w:t>
@@ -168,7 +159,7 @@
       <w:r>
         <w:drawing>
           <wp:inline xmlns:a="http://schemas.openxmlformats.org/drawingml/2006/main" xmlns:pic="http://schemas.openxmlformats.org/drawingml/2006/picture">
-            <wp:extent cx="5303520" cy="3374967"/>
+            <wp:extent cx="5394960" cy="2352203"/>
             <wp:docPr id="1" name="Picture 1"/>
             <wp:cNvGraphicFramePr>
               <a:graphicFrameLocks noChangeAspect="1"/>
@@ -189,7 +180,7 @@
                   <pic:spPr>
                     <a:xfrm>
                       <a:off x="0" y="0"/>
-                      <a:ext cx="5303520" cy="3374967"/>
+                      <a:ext cx="5394960" cy="2352203"/>
                     </a:xfrm>
                     <a:prstGeom prst="rect"/>
                   </pic:spPr>
@@ -204,7 +195,6 @@
       <w:r>
         <w:rPr>
           <w:i/>
-          <w:sz w:val="22"/>
         </w:rPr>
         <w:t>Рисунок 1. Падение теста со страховкой до исправления</w:t>
       </w:r>
@@ -221,7 +211,6 @@
     <w:p>
       <w:r>
         <w:rPr>
-          <w:b w:val="0"/>
           <w:sz w:val="24"/>
         </w:rPr>
         <w:t>В BudgetController заменил total *= 5 на total *= 1.05m. Маршрут и формат ответа не трогал. После правки тест со страховкой и Happy Path прошли.</w:t>
@@ -322,7 +311,7 @@
           </w:tcPr>
           <w:p>
             <w:r>
-              <w:t>100 × 5, insurance=false</w:t>
+              <w:t>100 x 5, insurance=false</w:t>
             </w:r>
           </w:p>
         </w:tc>
@@ -364,7 +353,7 @@
           </w:tcPr>
           <w:p>
             <w:r>
-              <w:t>100 × 5, insurance=true</w:t>
+              <w:t>100 x 5, insurance=true</w:t>
             </w:r>
           </w:p>
         </w:tc>
@@ -532,7 +521,7 @@
           </w:tcPr>
           <w:p>
             <w:r>
-              <w:t>100.50 × 3</w:t>
+              <w:t>100.50 x 3</w:t>
             </w:r>
           </w:p>
         </w:tc>
@@ -561,7 +550,6 @@
     <w:p>
       <w:r>
         <w:rPr>
-          <w:b w:val="0"/>
           <w:sz w:val="24"/>
         </w:rPr>
       </w:r>
@@ -569,7 +557,6 @@
     <w:p>
       <w:r>
         <w:rPr>
-          <w:b w:val="0"/>
           <w:sz w:val="24"/>
         </w:rPr>
         <w:t>Фактический прогон после исправления: 6 passed, 0 failed.</w:t>
@@ -579,7 +566,7 @@
       <w:r>
         <w:drawing>
           <wp:inline xmlns:a="http://schemas.openxmlformats.org/drawingml/2006/main" xmlns:pic="http://schemas.openxmlformats.org/drawingml/2006/picture">
-            <wp:extent cx="5303520" cy="2989257"/>
+            <wp:extent cx="5394960" cy="2999598"/>
             <wp:docPr id="2" name="Picture 2"/>
             <wp:cNvGraphicFramePr>
               <a:graphicFrameLocks noChangeAspect="1"/>
@@ -600,7 +587,7 @@
                   <pic:spPr>
                     <a:xfrm>
                       <a:off x="0" y="0"/>
-                      <a:ext cx="5303520" cy="2989257"/>
+                      <a:ext cx="5394960" cy="2999598"/>
                     </a:xfrm>
                     <a:prstGeom prst="rect"/>
                   </pic:spPr>
@@ -615,7 +602,6 @@
       <w:r>
         <w:rPr>
           <w:i/>
-          <w:sz w:val="22"/>
         </w:rPr>
         <w:t>Рисунок 2. Все тесты проходят после исправления</w:t>
       </w:r>
@@ -632,7 +618,6 @@
     <w:p>
       <w:r>
         <w:rPr>
-          <w:b w:val="0"/>
           <w:sz w:val="24"/>
         </w:rPr>
         <w:t>Собрал покрытие командой dotnet test --collect:"XPlat Code Coverage". По Cobertura для BudgetController: line coverage 100%, branch coverage 100%. Отработаны обе ветки Days &lt;= 0 и IncludeInsurance.</w:t>
@@ -641,7 +626,6 @@
     <w:p>
       <w:r>
         <w:rPr>
-          <w:b w:val="0"/>
           <w:sz w:val="24"/>
         </w:rPr>
         <w:t>Общий line-rate по сборке API ниже (около 73,7%), потому что в отчёт попадают и служебные файлы Web SDK; для метода Calculate это не показатель.</w:t>
@@ -651,7 +635,7 @@
       <w:r>
         <w:drawing>
           <wp:inline xmlns:a="http://schemas.openxmlformats.org/drawingml/2006/main" xmlns:pic="http://schemas.openxmlformats.org/drawingml/2006/picture">
-            <wp:extent cx="5303520" cy="2989257"/>
+            <wp:extent cx="5394960" cy="2870119"/>
             <wp:docPr id="3" name="Picture 3"/>
             <wp:cNvGraphicFramePr>
               <a:graphicFrameLocks noChangeAspect="1"/>
@@ -672,7 +656,7 @@
                   <pic:spPr>
                     <a:xfrm>
                       <a:off x="0" y="0"/>
-                      <a:ext cx="5303520" cy="2989257"/>
+                      <a:ext cx="5394960" cy="2870119"/>
                     </a:xfrm>
                     <a:prstGeom prst="rect"/>
                   </pic:spPr>
@@ -687,7 +671,6 @@
       <w:r>
         <w:rPr>
           <w:i/>
-          <w:sz w:val="22"/>
         </w:rPr>
         <w:t>Рисунок 3. Сводка покрытия BudgetController</w:t>
       </w:r>
@@ -704,7 +687,6 @@
     <w:p>
       <w:r>
         <w:rPr>
-          <w:b w:val="0"/>
           <w:sz w:val="24"/>
         </w:rPr>
         <w:t>Тесты помогли сразу увидеть ошибку в страховке (2500 вместо 525) и проверить граничные случаи: отрицательные и нулевые дни, нулевую дневную стоимость и дробные суммы. После правки коэффициента все шесть тестов проходят, ветки контроллера закрыты покрытием.</w:t>

</xml_diff>

<commit_message>
docs: replace stylized evidence with real PowerShell captures
Co-authored-by: Cursor <cursoragent@cursor.com>
</commit_message>
<xml_diff>
--- a/reports/BudgetCalculator_TestReport.docx
+++ b/reports/BudgetCalculator_TestReport.docx
@@ -47,7 +47,7 @@
         <w:rPr>
           <w:sz w:val="24"/>
         </w:rPr>
-        <w:t>Дата: 2026-10-12</w:t>
+        <w:t>Дата: 2026-10-13</w:t>
       </w:r>
     </w:p>
     <w:p>
@@ -71,7 +71,7 @@
         <w:rPr>
           <w:sz w:val="24"/>
         </w:rPr>
-        <w:t>Нужно было разобраться с unit-тестами для ASP.NET Core контроллера расчёта бюджета: написать xUnit-тесты, поймать ошибку в страховке, исправить её и посмотреть покрытие кода.</w:t>
+        <w:t>Нужно было написать xUnit-тесты для ASP.NET Core контроллера расчёта бюджета, воспроизвести ошибку в страховке, исправить её и проверить покрытие.</w:t>
       </w:r>
     </w:p>
     <w:p>
@@ -88,15 +88,7 @@
         <w:rPr>
           <w:sz w:val="24"/>
         </w:rPr>
-        <w:t>Стартового репозитория в рабочей папке не оказалось, поэтому собрал минимальный ASP.NET Core Web API (net9.0) по примеру из задания: модель BudgetRequest и BudgetController с маршрутом POST /api/budget/calculate.</w:t>
-      </w:r>
-    </w:p>
-    <w:p>
-      <w:r>
-        <w:rPr>
-          <w:sz w:val="24"/>
-        </w:rPr>
-        <w:t>Стек: .NET SDK 9.0.318, xUnit 2.9.2, Microsoft.NET.Test.Sdk, xunit.runner.visualstudio, coverlet.collector. Тесты вызывают контроллер напрямую, без поднятия HTTP-сервера.</w:t>
+        <w:t>Стартового репозитория не было, поэтому собрал минимальный Web API (net9.0) по примеру из задания. Стек: .NET SDK 9.0.318, xUnit 2.9.2, coverlet.collector. Тесты вызывают BudgetController напрямую.</w:t>
       </w:r>
     </w:p>
     <w:p>
@@ -113,16 +105,7 @@
         <w:rPr>
           <w:sz w:val="24"/>
         </w:rPr>
-        <w:t>Сначала проверил обычный расчёт без страховки. На стоимости 100 рублей за день и пяти днях получилось 500 рублей — тест прошёл.</w:t>
-      </w:r>
-    </w:p>
-    <w:p>
-      <w:r>
-        <w:rPr>
-          <w:rFonts w:ascii="Consolas" w:hAnsi="Consolas"/>
-          <w:sz w:val="18"/>
-        </w:rPr>
-        <w:t>DailyCost = 100, Days = 5, IncludeInsurance = false -&gt; TotalAmount = 500, HTTP 200</w:t>
+        <w:t>Обычный расчёт без страховки: 100 рублей за день и 5 дней дают 500 рублей — тест прошёл.</w:t>
       </w:r>
     </w:p>
     <w:p>
@@ -139,7 +122,7 @@
         <w:rPr>
           <w:sz w:val="24"/>
         </w:rPr>
-        <w:t>Потом добавил проверку со страховкой и увидел, что вместо 525 рублей метод возвращает 2500. Ошибка оказалась в коэффициенте: стоимость умножалась на 5 вместо увеличения на 5%.</w:t>
+        <w:t>Исторический прогон воспроизведён из коммита 817d011 в отдельном git worktree. Тест со страховкой упал: ожидалось 525, фактически 2500. В контроллере стоимость умножалась на 5 вместо +5%.</w:t>
       </w:r>
     </w:p>
     <w:p>
@@ -157,9 +140,31 @@
     </w:p>
     <w:p>
       <w:r>
+        <w:rPr>
+          <w:rFonts w:ascii="Consolas" w:hAnsi="Consolas"/>
+          <w:sz w:val="18"/>
+        </w:rPr>
+        <w:t xml:space="preserve">  2500</w:t>
+        <w:br/>
+        <w:t xml:space="preserve">  Stack Trace:</w:t>
+        <w:br/>
+        <w:t xml:space="preserve">     at BudgetCalculator.Tests.BudgetControllerTests.Calculate_WithInsurance_Returns200And525() in C:\Users\user\Desktop\budget-calculator-xunit-red-817d011\tests\BudgetCalculator.Tests\BudgetControllerTests.cs:line 50</w:t>
+        <w:br/>
+        <w:t xml:space="preserve">   at System.RuntimeMethodHandle.InvokeMethod(Object target, Void** arguments, Signature sig, Boolean isConstructor)</w:t>
+        <w:br/>
+        <w:t xml:space="preserve">   at System.Reflection.MethodBaseInvoker.InvokeWithNoArgs(Object obj, BindingFlags invokeAttr)</w:t>
+        <w:br/>
+        <w:br/>
+        <w:t>Failed!  - Failed:     1, Passed:     1, Skipped:     0, Total:     2, Duration: 16 ms - BudgetCalculator.Tests.dll (net9.0)</w:t>
+        <w:br/>
+        <w:t>[xUnit.net 00:00:00.11]     BudgetCalculator.Tests.BudgetControllerTests.Calculate_WithInsurance_Returns200And525 [FAIL]</w:t>
+      </w:r>
+    </w:p>
+    <w:p>
+      <w:r>
         <w:drawing>
           <wp:inline xmlns:a="http://schemas.openxmlformats.org/drawingml/2006/main" xmlns:pic="http://schemas.openxmlformats.org/drawingml/2006/picture">
-            <wp:extent cx="5394960" cy="2352203"/>
+            <wp:extent cx="5394960" cy="2765300"/>
             <wp:docPr id="1" name="Picture 1"/>
             <wp:cNvGraphicFramePr>
               <a:graphicFrameLocks noChangeAspect="1"/>
@@ -180,7 +185,7 @@
                   <pic:spPr>
                     <a:xfrm>
                       <a:off x="0" y="0"/>
-                      <a:ext cx="5394960" cy="2352203"/>
+                      <a:ext cx="5394960" cy="2765300"/>
                     </a:xfrm>
                     <a:prstGeom prst="rect"/>
                   </pic:spPr>
@@ -195,8 +200,9 @@
       <w:r>
         <w:rPr>
           <w:i/>
+          <w:sz w:val="22"/>
         </w:rPr>
-        <w:t>Рисунок 1. Падение теста со страховкой до исправления</w:t>
+        <w:t>Рисунок 1. Реальный PowerShell: падение теста на коммите 817d011 (Expected 525 / Actual 2500)</w:t>
       </w:r>
     </w:p>
     <w:p>
@@ -213,22 +219,7 @@
         <w:rPr>
           <w:sz w:val="24"/>
         </w:rPr>
-        <w:t>В BudgetController заменил total *= 5 на total *= 1.05m. Маршрут и формат ответа не трогал. После правки тест со страховкой и Happy Path прошли.</w:t>
-      </w:r>
-    </w:p>
-    <w:p>
-      <w:r>
-        <w:rPr>
-          <w:rFonts w:ascii="Consolas" w:hAnsi="Consolas"/>
-          <w:sz w:val="18"/>
-        </w:rPr>
-        <w:t>if (request.IncludeInsurance)</w:t>
-        <w:br/>
-        <w:t>{</w:t>
-        <w:br/>
-        <w:t xml:space="preserve">    total *= 1.05m;</w:t>
-        <w:br/>
-        <w:t>}</w:t>
+        <w:t>В BudgetController заменил total *= 5 на total *= 1.05m. Маршрут и схему ответа не менял.</w:t>
       </w:r>
     </w:p>
     <w:p>
@@ -269,7 +260,7 @@
           </w:tcPr>
           <w:p>
             <w:r>
-              <w:t>Входные данные</w:t>
+              <w:t>Вход</w:t>
             </w:r>
           </w:p>
         </w:tc>
@@ -311,7 +302,7 @@
           </w:tcPr>
           <w:p>
             <w:r>
-              <w:t>100 x 5, insurance=false</w:t>
+              <w:t>100x5, false</w:t>
             </w:r>
           </w:p>
         </w:tc>
@@ -321,7 +312,7 @@
           </w:tcPr>
           <w:p>
             <w:r>
-              <w:t>200, 500</w:t>
+              <w:t>200 / 500</w:t>
             </w:r>
           </w:p>
         </w:tc>
@@ -353,7 +344,7 @@
           </w:tcPr>
           <w:p>
             <w:r>
-              <w:t>100 x 5, insurance=true</w:t>
+              <w:t>100x5, true</w:t>
             </w:r>
           </w:p>
         </w:tc>
@@ -363,7 +354,7 @@
           </w:tcPr>
           <w:p>
             <w:r>
-              <w:t>200, 525</w:t>
+              <w:t>200 / 525</w:t>
             </w:r>
           </w:p>
         </w:tc>
@@ -395,7 +386,7 @@
           </w:tcPr>
           <w:p>
             <w:r>
-              <w:t>Days = -1</w:t>
+              <w:t>Days=-1</w:t>
             </w:r>
           </w:p>
         </w:tc>
@@ -405,7 +396,7 @@
           </w:tcPr>
           <w:p>
             <w:r>
-              <w:t>400 BadRequest</w:t>
+              <w:t>400</w:t>
             </w:r>
           </w:p>
         </w:tc>
@@ -437,7 +428,7 @@
           </w:tcPr>
           <w:p>
             <w:r>
-              <w:t>Days = 0</w:t>
+              <w:t>Days=0</w:t>
             </w:r>
           </w:p>
         </w:tc>
@@ -447,7 +438,7 @@
           </w:tcPr>
           <w:p>
             <w:r>
-              <w:t>400 BadRequest</w:t>
+              <w:t>400</w:t>
             </w:r>
           </w:p>
         </w:tc>
@@ -479,7 +470,7 @@
           </w:tcPr>
           <w:p>
             <w:r>
-              <w:t>DailyCost = 0, Days = 5</w:t>
+              <w:t>DailyCost=0</w:t>
             </w:r>
           </w:p>
         </w:tc>
@@ -489,7 +480,7 @@
           </w:tcPr>
           <w:p>
             <w:r>
-              <w:t>200, 0</w:t>
+              <w:t>200 / 0</w:t>
             </w:r>
           </w:p>
         </w:tc>
@@ -521,7 +512,7 @@
           </w:tcPr>
           <w:p>
             <w:r>
-              <w:t>100.50 x 3</w:t>
+              <w:t>100.50x3</w:t>
             </w:r>
           </w:p>
         </w:tc>
@@ -531,7 +522,7 @@
           </w:tcPr>
           <w:p>
             <w:r>
-              <w:t>200, 301.50</w:t>
+              <w:t>200 / 301.50</w:t>
             </w:r>
           </w:p>
         </w:tc>
@@ -559,14 +550,14 @@
         <w:rPr>
           <w:sz w:val="24"/>
         </w:rPr>
-        <w:t>Фактический прогон после исправления: 6 passed, 0 failed.</w:t>
+        <w:t>Актуальный прогон на main: 6 passed / 0 failed.</w:t>
       </w:r>
     </w:p>
     <w:p>
       <w:r>
         <w:drawing>
           <wp:inline xmlns:a="http://schemas.openxmlformats.org/drawingml/2006/main" xmlns:pic="http://schemas.openxmlformats.org/drawingml/2006/picture">
-            <wp:extent cx="5394960" cy="2999598"/>
+            <wp:extent cx="5394960" cy="3045330"/>
             <wp:docPr id="2" name="Picture 2"/>
             <wp:cNvGraphicFramePr>
               <a:graphicFrameLocks noChangeAspect="1"/>
@@ -587,7 +578,7 @@
                   <pic:spPr>
                     <a:xfrm>
                       <a:off x="0" y="0"/>
-                      <a:ext cx="5394960" cy="2999598"/>
+                      <a:ext cx="5394960" cy="3045330"/>
                     </a:xfrm>
                     <a:prstGeom prst="rect"/>
                   </pic:spPr>
@@ -602,8 +593,9 @@
       <w:r>
         <w:rPr>
           <w:i/>
+          <w:sz w:val="22"/>
         </w:rPr>
-        <w:t>Рисунок 2. Все тесты проходят после исправления</w:t>
+        <w:t>Рисунок 2. Реальный PowerShell: dotnet test — 6 passed</w:t>
       </w:r>
     </w:p>
     <w:p>
@@ -620,22 +612,14 @@
         <w:rPr>
           <w:sz w:val="24"/>
         </w:rPr>
-        <w:t>Собрал покрытие командой dotnet test --collect:"XPlat Code Coverage". По Cobertura для BudgetController: line coverage 100%, branch coverage 100%. Отработаны обе ветки Days &lt;= 0 и IncludeInsurance.</w:t>
-      </w:r>
-    </w:p>
-    <w:p>
-      <w:r>
-        <w:rPr>
-          <w:sz w:val="24"/>
-        </w:rPr>
-        <w:t>Общий line-rate по сборке API ниже (около 73,7%), потому что в отчёт попадают и служебные файлы Web SDK; для метода Calculate это не показатель.</w:t>
+        <w:t>Команда: dotnet test --collect:"XPlat Code Coverage". По Cobertura для BudgetController: line 100%, branch 100%. Файл reports/coverage.cobertura.xml.</w:t>
       </w:r>
     </w:p>
     <w:p>
       <w:r>
         <w:drawing>
           <wp:inline xmlns:a="http://schemas.openxmlformats.org/drawingml/2006/main" xmlns:pic="http://schemas.openxmlformats.org/drawingml/2006/picture">
-            <wp:extent cx="5394960" cy="2870119"/>
+            <wp:extent cx="5394960" cy="3045330"/>
             <wp:docPr id="3" name="Picture 3"/>
             <wp:cNvGraphicFramePr>
               <a:graphicFrameLocks noChangeAspect="1"/>
@@ -656,7 +640,7 @@
                   <pic:spPr>
                     <a:xfrm>
                       <a:off x="0" y="0"/>
-                      <a:ext cx="5394960" cy="2870119"/>
+                      <a:ext cx="5394960" cy="3045330"/>
                     </a:xfrm>
                     <a:prstGeom prst="rect"/>
                   </pic:spPr>
@@ -671,8 +655,9 @@
       <w:r>
         <w:rPr>
           <w:i/>
+          <w:sz w:val="22"/>
         </w:rPr>
-        <w:t>Рисунок 3. Сводка покрытия BudgetController</w:t>
+        <w:t>Рисунок 3. Реальный PowerShell: collection coverage, BudgetController 100%/100%</w:t>
       </w:r>
     </w:p>
     <w:p>
@@ -689,7 +674,7 @@
         <w:rPr>
           <w:sz w:val="24"/>
         </w:rPr>
-        <w:t>Тесты помогли сразу увидеть ошибку в страховке (2500 вместо 525) и проверить граничные случаи: отрицательные и нулевые дни, нулевую дневную стоимость и дробные суммы. После правки коэффициента все шесть тестов проходят, ветки контроллера закрыты покрытием.</w:t>
+        <w:t>Тесты нашли ошибку страховки (2500 вместо 525) на коммите 817d011, после правки все шесть кейсов проходят, ветки Days&lt;=0 и IncludeInsurance закрыты покрытием.</w:t>
       </w:r>
     </w:p>
     <w:sectPr>

</xml_diff>